<commit_message>
SIH Demo Readiness: Complete end-to-end validation - flagship workflow, coding workflow, HITL approval, DOCX generation, audit chain verified
</commit_message>
<xml_diff>
--- a/backend/data/workspaces/Approval_Note.docx
+++ b/backend/data/workspaces/Approval_Note.docx
@@ -46,7 +46,7 @@
     </w:p>
     <w:p>
       <w:r>
-        <w:t>Safety_SOP_Standard_Procedure.txt (Page 1): # SAFETY SOP-17: INDUSTRIAL PRESSURE RELIEF VALVES Maximum Operating Pressure Ceiling: 120.0 PSI. Over-pressure Threshold: Any reading exceeding 135.0 PSI constitutes a CRITICAL SAFETY DEVIATION.</w:t>
+        <w:t>Safety_SOP_Standard_Procedure.pdf (Page 13): SOP-17 Section 4.2: Pressure relief valve inspection must occur every 90 days with documented calibration logs.</w:t>
       </w:r>
     </w:p>
     <w:p>
@@ -59,7 +59,7 @@
     </w:p>
     <w:p>
       <w:r>
-        <w:t>Action approved by Operator. Approval Ticket ID: bb15253a-6ef8-4587-aad5-ceb2806607f0</w:t>
+        <w:t>Action approved by Operator. Approval Ticket ID: e6db12d7-044e-46d2-9eaf-d279ddb0607c</w:t>
       </w:r>
     </w:p>
     <w:sectPr>

</xml_diff>

<commit_message>
Fix Tasks, Documents, Knowledge Base, Security/Sentinel, and Settings pages: connect to real backend APIs, add loading, empty, and error states, and list workspace documents and RAG chunks
</commit_message>
<xml_diff>
--- a/backend/data/workspaces/Approval_Note.docx
+++ b/backend/data/workspaces/Approval_Note.docx
@@ -46,7 +46,7 @@
     </w:p>
     <w:p>
       <w:r>
-        <w:t>Safety_SOP_Standard_Procedure.pdf (Page 13): SOP-17 Section 4.2: Pressure relief valve inspection must occur every 90 days with documented calibration logs.</w:t>
+        <w:t>Safety_SOP_Standard_Procedure.txt (Page 1): # SAFETY SOP-17: INDUSTRIAL PRESSURE RELIEF VALVES Maximum Operating Pressure Ceiling: 120.0 PSI. Over-pressure Threshold: Any reading exceeding 135.0 PSI constitutes a CRITICAL SAFETY DEVIATION.</w:t>
       </w:r>
     </w:p>
     <w:p>
@@ -59,7 +59,7 @@
     </w:p>
     <w:p>
       <w:r>
-        <w:t>Action approved by Operator. Approval Ticket ID: e6db12d7-044e-46d2-9eaf-d279ddb0607c</w:t>
+        <w:t>Action approved by Operator. Approval Ticket ID: 3bd10d91-50e1-41b0-a1a8-ed8acd2e6de7</w:t>
       </w:r>
     </w:p>
     <w:sectPr>

</xml_diff>

<commit_message>
Fix: Complete document processing and RAG integration
- Implement DOCX extraction using python-docx library
- Implement XLSX extraction using openpyxl library
- Remove hardcoded RAG fallback, return actual ingested documents
- Enhance document upload endpoint with metadata and content preview
- Implement query-aware task code generation in orchestrator
- Update DOCX report generation to use actual RAG citations
- Add comprehensive validation tests

Fixes:
- DOCX/XLSX files now properly extracted instead of placeholder text
- RAG search returns real documents instead of hardcoded SOP-17
- Document upload response shows actual extracted content
- Task execution references actual document content in reports
- All audit logs properly track document processing

Validation:
- Lab_Assignment_Test.docx successfully processed
- RAG search returns actual document content
- Task execution receives proper RAG results
- Audit trail shows all document operations
</commit_message>
<xml_diff>
--- a/backend/data/workspaces/Approval_Note.docx
+++ b/backend/data/workspaces/Approval_Note.docx
@@ -7,7 +7,7 @@
         <w:pStyle w:val="Title"/>
       </w:pPr>
       <w:r>
-        <w:t>OFFICIAL ENGINEERING APPROVAL NOTE</w:t>
+        <w:t>OFFICIAL ANALYSIS REPORT</w:t>
       </w:r>
     </w:p>
     <w:p>
@@ -20,6 +20,9 @@
     </w:p>
     <w:p>
       <w:r>
+        <w:t>Analysis Report for: Please analyze the Lab Assignment DOCX document and extract key findings about document processing...</w:t>
+        <w:br/>
+        <w:br/>
         <w:t>Industrial inspection report analysis performed under air-gapped Sovereign AI Workbench supervision.</w:t>
       </w:r>
     </w:p>
@@ -28,12 +31,23 @@
         <w:pStyle w:val="Heading1"/>
       </w:pPr>
       <w:r>
-        <w:t>Key Finding &amp; Deviation</w:t>
+        <w:t>Analysis Results</w:t>
       </w:r>
     </w:p>
     <w:p>
       <w:r>
-        <w:t>Critical pressure reading detected. Calculation result: Pressure Variance: 19.00% (CRITICAL OVERPRESSURE)</w:t>
+        <w:t>Task Execution Complete</w:t>
+        <w:br/>
+        <w:br/>
+        <w:t>{</w:t>
+        <w:br/>
+        <w:t xml:space="preserve">  "documents_processed": 1,</w:t>
+        <w:br/>
+        <w:t xml:space="preserve">  "key_findings": "Document content successfully analyzed",</w:t>
+        <w:br/>
+        <w:t xml:space="preserve">  "status": "complete"</w:t>
+        <w:br/>
+        <w:t>}</w:t>
       </w:r>
     </w:p>
     <w:p>
@@ -41,12 +55,14 @@
         <w:pStyle w:val="Heading1"/>
       </w:pPr>
       <w:r>
-        <w:t>Safety SOP Compliance Reference</w:t>
+        <w:t>Reference Materials</w:t>
       </w:r>
     </w:p>
     <w:p>
       <w:r>
-        <w:t>Safety_SOP_Standard_Procedure.txt (Page 1): # SAFETY SOP-17: INDUSTRIAL PRESSURE RELIEF VALVES Maximum Operating Pressure Ceiling: 120.0 PSI. Over-pressure Threshold: Any reading exceeding 135.0 PSI constitutes a CRITICAL SAFETY DEVIATION.</w:t>
+        <w:t>Lab_Assignment_Test.docx (Page 1): Lab Assignment Test Document Introduction This is a test document for validating DOCX processing in the Sovereign AI Workbench. It contains various sections to ensure proper text extraction and chunking. Objective To verify that uploaded DOCX files are properly processed and indexed in the local RAG system rather than returning placeholder text. Key Findings Finding 1: System should extract actual document content Finding 2: RAG search should return ingested documents Finding 3: Reports should reference actual document content Technical Details Processing layers: 1. Document Processor extracts text from DOCX files using python-docx 2. Text is chunked into 500-word segments for RAG indexing 3. Vector Store stores chunks for similarity search 4. Orchestrator uses RAG results in task execution Conclusion This document serves as a validation artifact to confirm that the system properly processes and retrieves real document content from uploaded files. [TABLE] Component | Status [TABLE] Document Processor | Fixed - Handles DOCX/XLSX [TABLE] RAG Vector Store | Fixed - Returns real documents</w:t>
+        <w:br/>
+        <w:t>Safety_SOP_Standard_Procedure.pdf (Page 13): SOP-17 Section 4.2: Pressure relief valve inspection must occur every 90 days with documented calibration logs. Maximum Operating Pressure Ceiling: 120.0 PSI. Over-pressure Threshold: Any reading exceeding 135.0 PSI constitutes a CRITICAL SAFETY DEVIATION.</w:t>
       </w:r>
     </w:p>
     <w:p>
@@ -59,7 +75,7 @@
     </w:p>
     <w:p>
       <w:r>
-        <w:t>Action approved by Operator. Approval Ticket ID: 0095d031-d935-43b7-a8cc-4e5fa5af746d</w:t>
+        <w:t>Action approved by Operator. Approval Ticket ID: cb751182-bde3-4034-8000-1b40bf8a6110</w:t>
       </w:r>
     </w:p>
     <w:sectPr>

</xml_diff>